<commit_message>
Manuales: intercalado, ficha técnica en PDF y nuestro hardware
Manual de la página web: secciones nuevas 4.8 (intercalar filas, paso a
paso) y 4.9 (la ficha técnica en PDF: qué cargar antes, cómo se descarga
y qué tiene), con capturas de la ventana Intercalar, la grilla de
ejemplo, la ficha del dibujo y la página del PDF. Los ítems de 4.5
remiten a ellas.

Manual del telar en fábrica: sección nueva 3.3 (nuestro hardware: el
gabinete, sus cinco plaquetas, los prensacables, lo que tiene que saber
el operario y el enlace al modelo 3D), con la imagen del gabinete.

Web: tocar una celda movía la posición del tejido (curRow), así que un
dibujo sin tejer mostraba «En pausa · Fila 7 / 7». La fila tocada va
aparte (filaElegida); el simulador de color e Intercalar la siguen
proponiendo. Prueba nueva en frontend.test.mjs.

Co-Authored-By: Claude Opus 5.5 <noreply@anthropic.com>
Claude-Session: https://claude.ai/code/session_01QiY8ZZNAM9gwPKiqSkCaaj
</commit_message>
<xml_diff>
--- a/documentacion_proyecto/Manual Telar Fabrica.docx
+++ b/documentacion_proyecto/Manual Telar Fabrica.docx
@@ -1930,6 +1930,349 @@
           <w:rtl w:val="0"/>
         </w:rPr>
         <w:t xml:space="preserve">Esto todavía no funciona sobre el telar real. Al 10/10/2026 se probó todo el circuito en protoboard (el sensor de pasada y el relé de selección con el ESP32) y funcionó; ahora se está haciendo la plaqueta para probarlo de manera correcta en la máquina. Vamos a actualizar este manual cuando esté instalado y probado en el telar.</w:t>
+      </w:r>
+    </w:p>
+    <w:p>
+      <w:pPr>
+        <w:keepNext/>
+        <w:rPr>
+          <w:rFonts w:ascii="IBM Plex Sans" w:cs="IBM Plex Sans" w:eastAsia="IBM Plex Sans" w:hAnsi="IBM Plex Sans"/>
+          <w:b w:val="1"/>
+          <w:bCs w:val="1"/>
+          <w:color w:val="3D6B96"/>
+        </w:rPr>
+      </w:pPr>
+      <w:r>
+        <w:rPr>
+          <w:rFonts w:ascii="IBM Plex Sans" w:cs="IBM Plex Sans" w:eastAsia="IBM Plex Sans" w:hAnsi="IBM Plex Sans"/>
+          <w:b w:val="1"/>
+          <w:bCs w:val="1"/>
+          <w:color w:val="3D6B96"/>
+          <w:rtl w:val="0"/>
+        </w:rPr>
+        <w:t xml:space="preserve">3.3 Nuestro hardware: el gabinete de control</w:t>
+      </w:r>
+    </w:p>
+    <w:p>
+      <w:pPr>
+        <w:rPr>
+          <w:rFonts w:ascii="IBM Plex Sans" w:cs="IBM Plex Sans" w:eastAsia="IBM Plex Sans" w:hAnsi="IBM Plex Sans"/>
+        </w:rPr>
+      </w:pPr>
+      <w:r>
+        <w:rPr>
+          <w:rFonts w:ascii="IBM Plex Sans" w:cs="IBM Plex Sans" w:eastAsia="IBM Plex Sans" w:hAnsi="IBM Plex Sans"/>
+          <w:rtl w:val="0"/>
+        </w:rPr>
+        <w:t xml:space="preserve">Todo lo que le agregamos al telar está en un solo gabinete: una caja estanca IP65 de 300 × 230 × 106 mm, montada en la pared o en una columna, fuera del chasis del telar, para que no reciba la vibración de la máquina. Adentro hay cinco plaquetas, cada una con su tarea:</w:t>
+      </w:r>
+    </w:p>
+    <w:p>
+      <w:pPr>
+        <w:numPr>
+          <w:ilvl w:val="0"/>
+          <w:numId w:val="1"/>
+        </w:numPr>
+        <w:ind w:left="720" w:hanging="360"/>
+        <w:rPr/>
+      </w:pPr>
+      <w:r>
+        <w:rPr>
+          <w:rFonts w:ascii="IBM Plex Sans" w:cs="IBM Plex Sans" w:eastAsia="IBM Plex Sans" w:hAnsi="IBM Plex Sans"/>
+          <w:b w:val="1"/>
+          <w:bCs w:val="1"/>
+          <w:rtl w:val="0"/>
+        </w:rPr>
+        <w:t xml:space="preserve">Fuente:</w:t>
+      </w:r>
+      <w:r>
+        <w:rPr>
+          <w:rFonts w:ascii="IBM Plex Sans" w:cs="IBM Plex Sans" w:eastAsia="IBM Plex Sans" w:hAnsi="IBM Plex Sans"/>
+          <w:rtl w:val="0"/>
+        </w:rPr>
+        <w:t xml:space="preserve"> convierte los 220 V de la red en los 5 V que usa todo el gabinete (un módulo HLK-5M05), con un fusible de 1 A lento en la fase. Es la única plaqueta con 220 V y está separada de las demás.</w:t>
+      </w:r>
+    </w:p>
+    <w:p>
+      <w:pPr>
+        <w:numPr>
+          <w:ilvl w:val="0"/>
+          <w:numId w:val="1"/>
+        </w:numPr>
+        <w:ind w:left="720" w:hanging="360"/>
+        <w:rPr/>
+      </w:pPr>
+      <w:r>
+        <w:rPr>
+          <w:rFonts w:ascii="IBM Plex Sans" w:cs="IBM Plex Sans" w:eastAsia="IBM Plex Sans" w:hAnsi="IBM Plex Sans"/>
+          <w:b w:val="1"/>
+          <w:bCs w:val="1"/>
+          <w:rtl w:val="0"/>
+        </w:rPr>
+        <w:t xml:space="preserve">Principal:</w:t>
+      </w:r>
+      <w:r>
+        <w:rPr>
+          <w:rFonts w:ascii="IBM Plex Sans" w:cs="IBM Plex Sans" w:eastAsia="IBM Plex Sans" w:hAnsi="IBM Plex Sans"/>
+          <w:rtl w:val="0"/>
+        </w:rPr>
+        <w:t xml:space="preserve"> lleva el ESP32, el microcontrolador que se conecta por WiFi con la aplicación y decide qué relé accionar. Su LED azul queda encendido cuando está conectado a la red.</w:t>
+      </w:r>
+    </w:p>
+    <w:p>
+      <w:pPr>
+        <w:numPr>
+          <w:ilvl w:val="0"/>
+          <w:numId w:val="1"/>
+        </w:numPr>
+        <w:ind w:left="720" w:hanging="360"/>
+        <w:rPr/>
+      </w:pPr>
+      <w:r>
+        <w:rPr>
+          <w:rFonts w:ascii="IBM Plex Sans" w:cs="IBM Plex Sans" w:eastAsia="IBM Plex Sans" w:hAnsi="IBM Plex Sans"/>
+          <w:b w:val="1"/>
+          <w:bCs w:val="1"/>
+          <w:rtl w:val="0"/>
+        </w:rPr>
+        <w:t xml:space="preserve">Relés:</w:t>
+      </w:r>
+      <w:r>
+        <w:rPr>
+          <w:rFonts w:ascii="IBM Plex Sans" w:cs="IBM Plex Sans" w:eastAsia="IBM Plex Sans" w:hAnsi="IBM Plex Sans"/>
+          <w:rtl w:val="0"/>
+        </w:rPr>
+        <w:t xml:space="preserve"> tres relés que «aprietan» Marcha, Pausa y Retroceder en paralelo con los botones de la máquina: un módulo de dos relés para Marcha y Pausa, y uno de un relé para Retroceder.</w:t>
+      </w:r>
+    </w:p>
+    <w:p>
+      <w:pPr>
+        <w:numPr>
+          <w:ilvl w:val="0"/>
+          <w:numId w:val="1"/>
+        </w:numPr>
+        <w:ind w:left="720" w:hanging="360"/>
+        <w:rPr/>
+      </w:pPr>
+      <w:r>
+        <w:rPr>
+          <w:rFonts w:ascii="IBM Plex Sans" w:cs="IBM Plex Sans" w:eastAsia="IBM Plex Sans" w:hAnsi="IBM Plex Sans"/>
+          <w:b w:val="1"/>
+          <w:bCs w:val="1"/>
+          <w:rtl w:val="0"/>
+        </w:rPr>
+        <w:t xml:space="preserve">Sensado de la botonera:</w:t>
+      </w:r>
+      <w:r>
+        <w:rPr>
+          <w:rFonts w:ascii="IBM Plex Sans" w:cs="IBM Plex Sans" w:eastAsia="IBM Plex Sans" w:hAnsi="IBM Plex Sans"/>
+          <w:rtl w:val="0"/>
+        </w:rPr>
+        <w:t xml:space="preserve"> detecta cuándo alguien aprieta un botón en la máquina, para que la aplicación lo muestre. Sus optoacopladores separan los 24 V de la botonera del resto del circuito.</w:t>
+      </w:r>
+    </w:p>
+    <w:p>
+      <w:pPr>
+        <w:numPr>
+          <w:ilvl w:val="0"/>
+          <w:numId w:val="1"/>
+        </w:numPr>
+        <w:ind w:left="720" w:hanging="360"/>
+        <w:rPr/>
+      </w:pPr>
+      <w:r>
+        <w:rPr>
+          <w:rFonts w:ascii="IBM Plex Sans" w:cs="IBM Plex Sans" w:eastAsia="IBM Plex Sans" w:hAnsi="IBM Plex Sans"/>
+          <w:b w:val="1"/>
+          <w:bCs w:val="1"/>
+          <w:rtl w:val="0"/>
+        </w:rPr>
+        <w:t xml:space="preserve">Nivel 2:</w:t>
+      </w:r>
+      <w:r>
+        <w:rPr>
+          <w:rFonts w:ascii="IBM Plex Sans" w:cs="IBM Plex Sans" w:eastAsia="IBM Plex Sans" w:hAnsi="IBM Plex Sans"/>
+          <w:rtl w:val="0"/>
+        </w:rPr>
+        <w:t xml:space="preserve"> la entrada del sensor de pasada y los cuatro relés LCA110 que van a ocupar el lugar de los lectores de la cinta. Todavía no está conectada al telar (punto 3.2).</w:t>
+      </w:r>
+    </w:p>
+    <w:p>
+      <w:pPr>
+        <w:keepNext/>
+        <w:jc w:val="center"/>
+        <w:rPr>
+          <w:rFonts w:ascii="IBM Plex Sans" w:cs="IBM Plex Sans" w:eastAsia="IBM Plex Sans" w:hAnsi="IBM Plex Sans"/>
+        </w:rPr>
+      </w:pPr>
+      <w:r>
+        <w:rPr>
+          <w:rFonts w:ascii="IBM Plex Sans" w:cs="IBM Plex Sans" w:eastAsia="IBM Plex Sans" w:hAnsi="IBM Plex Sans"/>
+        </w:rPr>
+        <w:drawing>
+          <wp:inline distB="0" distT="0" distL="114300" distR="114300">
+            <wp:extent cx="5040000" cy="3269000"/>
+            <wp:effectExtent b="0" l="0" r="0" t="0"/>
+            <wp:docPr id="625617035" name="image10.jpg"/>
+            <a:graphic>
+              <a:graphicData uri="http://schemas.openxmlformats.org/drawingml/2006/picture">
+                <pic:pic>
+                  <pic:nvPicPr>
+                    <pic:cNvPr id="0" name="image10.jpg"/>
+                    <pic:cNvPicPr preferRelativeResize="0"/>
+                  </pic:nvPicPr>
+                  <pic:blipFill>
+                    <a:blip r:embed="rId16"/>
+                    <a:srcRect b="0" l="0" r="0" t="0"/>
+                    <a:stretch>
+                      <a:fillRect/>
+                    </a:stretch>
+                  </pic:blipFill>
+                  <pic:spPr>
+                    <a:xfrm>
+                      <a:off x="0" y="0"/>
+                      <a:ext cx="5040000" cy="3269000"/>
+                    </a:xfrm>
+                    <a:prstGeom prst="rect"/>
+                    <a:ln/>
+                  </pic:spPr>
+                </pic:pic>
+              </a:graphicData>
+            </a:graphic>
+          </wp:inline>
+        </w:drawing>
+      </w:r>
+      <w:r>
+        <w:rPr>
+          <w:rtl w:val="0"/>
+        </w:rPr>
+      </w:r>
+    </w:p>
+    <w:p>
+      <w:pPr>
+        <w:jc w:val="center"/>
+        <w:rPr>
+          <w:rFonts w:ascii="IBM Plex Sans" w:cs="IBM Plex Sans" w:eastAsia="IBM Plex Sans" w:hAnsi="IBM Plex Sans"/>
+        </w:rPr>
+      </w:pPr>
+      <w:r>
+        <w:rPr>
+          <w:rFonts w:ascii="IBM Plex Sans" w:cs="IBM Plex Sans" w:eastAsia="IBM Plex Sans" w:hAnsi="IBM Plex Sans"/>
+          <w:i w:val="1"/>
+          <w:iCs w:val="1"/>
+          <w:color w:val="606060"/>
+          <w:sz w:val="18"/>
+          <w:szCs w:val="18"/>
+          <w:rtl w:val="0"/>
+        </w:rPr>
+        <w:t xml:space="preserve">El gabinete con la tapa abierta, en el modelo 3D: las cinco plaquetas, los prensacables y el cableado.</w:t>
+      </w:r>
+      <w:r>
+        <w:rPr>
+          <w:rtl w:val="0"/>
+        </w:rPr>
+      </w:r>
+    </w:p>
+    <w:p>
+      <w:pPr>
+        <w:rPr>
+          <w:rFonts w:ascii="IBM Plex Sans" w:cs="IBM Plex Sans" w:eastAsia="IBM Plex Sans" w:hAnsi="IBM Plex Sans"/>
+        </w:rPr>
+      </w:pPr>
+      <w:r>
+        <w:rPr>
+          <w:rFonts w:ascii="IBM Plex Sans" w:cs="IBM Plex Sans" w:eastAsia="IBM Plex Sans" w:hAnsi="IBM Plex Sans"/>
+          <w:rtl w:val="0"/>
+        </w:rPr>
+        <w:t xml:space="preserve">Los cables entran por cuatro prensacables, que mantienen la caja estanca: el de 220 V por la izquierda, el de la botonera (seis hilos, un par por botón) por la derecha, y por abajo el del sensor de pasada y el del Nivel 2. Entre plaquetas, los cables van enchufados, así que cada una se puede sacar sin desoldar.</w:t>
+      </w:r>
+    </w:p>
+    <w:p>
+      <w:pPr>
+        <w:keepNext/>
+        <w:rPr>
+          <w:rFonts w:ascii="IBM Plex Sans" w:cs="IBM Plex Sans" w:eastAsia="IBM Plex Sans" w:hAnsi="IBM Plex Sans"/>
+        </w:rPr>
+      </w:pPr>
+      <w:r>
+        <w:rPr>
+          <w:rFonts w:ascii="IBM Plex Sans" w:cs="IBM Plex Sans" w:eastAsia="IBM Plex Sans" w:hAnsi="IBM Plex Sans"/>
+          <w:b w:val="1"/>
+          <w:bCs w:val="1"/>
+          <w:rtl w:val="0"/>
+        </w:rPr>
+        <w:t xml:space="preserve">Para el operario:</w:t>
+      </w:r>
+    </w:p>
+    <w:p>
+      <w:pPr>
+        <w:numPr>
+          <w:ilvl w:val="0"/>
+          <w:numId w:val="3"/>
+        </w:numPr>
+        <w:ind w:left="720" w:hanging="360"/>
+        <w:rPr>
+          <w:rFonts w:ascii="IBM Plex Sans" w:cs="IBM Plex Sans" w:eastAsia="IBM Plex Sans" w:hAnsi="IBM Plex Sans"/>
+        </w:rPr>
+      </w:pPr>
+      <w:r>
+        <w:rPr>
+          <w:rFonts w:ascii="IBM Plex Sans" w:cs="IBM Plex Sans" w:eastAsia="IBM Plex Sans" w:hAnsi="IBM Plex Sans"/>
+          <w:rtl w:val="0"/>
+        </w:rPr>
+        <w:t xml:space="preserve">El gabinete no necesita ningún manejo: queda enchufado. Para saber si funciona, alcanza con mirar la aplicación: junto al estado del telar tiene que decir «ESP32 conectado».</w:t>
+      </w:r>
+    </w:p>
+    <w:p>
+      <w:pPr>
+        <w:numPr>
+          <w:ilvl w:val="0"/>
+          <w:numId w:val="3"/>
+        </w:numPr>
+        <w:ind w:left="720" w:hanging="360"/>
+        <w:rPr>
+          <w:rFonts w:ascii="IBM Plex Sans" w:cs="IBM Plex Sans" w:eastAsia="IBM Plex Sans" w:hAnsi="IBM Plex Sans"/>
+        </w:rPr>
+      </w:pPr>
+      <w:r>
+        <w:rPr>
+          <w:rFonts w:ascii="IBM Plex Sans" w:cs="IBM Plex Sans" w:eastAsia="IBM Plex Sans" w:hAnsi="IBM Plex Sans"/>
+          <w:rtl w:val="0"/>
+        </w:rPr>
+        <w:t xml:space="preserve">Si el gabinete se apaga o se desenchufa, el telar se sigue manejando con la botonera de siempre: los relés quedan abiertos y no aprietan nada.</w:t>
+      </w:r>
+    </w:p>
+    <w:p>
+      <w:pPr>
+        <w:numPr>
+          <w:ilvl w:val="0"/>
+          <w:numId w:val="3"/>
+        </w:numPr>
+        <w:ind w:left="720" w:hanging="360"/>
+        <w:rPr>
+          <w:rFonts w:ascii="IBM Plex Sans" w:cs="IBM Plex Sans" w:eastAsia="IBM Plex Sans" w:hAnsi="IBM Plex Sans"/>
+        </w:rPr>
+      </w:pPr>
+      <w:r>
+        <w:rPr>
+          <w:rFonts w:ascii="IBM Plex Sans" w:cs="IBM Plex Sans" w:eastAsia="IBM Plex Sans" w:hAnsi="IBM Plex Sans"/>
+          <w:rtl w:val="0"/>
+        </w:rPr>
+        <w:t xml:space="preserve">La tapa la abre solo el equipo del proyecto o el de mantenimiento, con el gabinete desenchufado: adentro hay 220 V.</w:t>
+      </w:r>
+    </w:p>
+    <w:p>
+      <w:pPr>
+        <w:rPr>
+          <w:rFonts w:ascii="IBM Plex Sans" w:cs="IBM Plex Sans" w:eastAsia="IBM Plex Sans" w:hAnsi="IBM Plex Sans"/>
+        </w:rPr>
+      </w:pPr>
+      <w:r>
+        <w:rPr>
+          <w:rFonts w:ascii="IBM Plex Sans" w:cs="IBM Plex Sans" w:eastAsia="IBM Plex Sans" w:hAnsi="IBM Plex Sans"/>
+          <w:rtl w:val="0"/>
+        </w:rPr>
+        <w:t xml:space="preserve">El armado y el conexionado, plaqueta por plaqueta, están en la Guía de conexión y puesta en marcha. El gabinete también se puede recorrer en un modelo 3D interactivo, con cada componente explicado: manfredojuanignacio08-prog.github.io/Modelado3D_CIT.</w:t>
       </w:r>
     </w:p>
     <w:p>

</xml_diff>